<commit_message>
Corregir validación del Word de tablas Llamoja
Co-Authored-By: Claude Opus 5.5 <noreply@anthropic.com>
Claude-Session: https://claude.ai/code/session_015AyYbx48wKJZQc75MGcDui
</commit_message>
<xml_diff>
--- a/Tabla_vicios_motivacion_Llamoja.docx
+++ b/Tabla_vicios_motivacion_Llamoja.docx
@@ -32,8 +32,8 @@
       <w:tblPr>
         <w:tblW w:type="auto" w:w="0"/>
         <w:tblLayout w:type="fixed"/>
+        <w:tblLayout w:type="fixed"/>
         <w:tblLook w:firstColumn="1" w:firstRow="1" w:lastColumn="0" w:lastRow="0" w:noHBand="0" w:noVBand="1" w:val="04A0"/>
-        <w:tblLayout w:type="fixed"/>
       </w:tblPr>
       <w:tblGrid>
         <w:gridCol w:w="4270"/>
@@ -46,11 +46,11 @@
         <w:tc>
           <w:tcPr>
             <w:tcW w:type="dxa" w:w="4270"/>
-            <w:vAlign w:val="center"/>
             <w:tcBorders>
               <w:top w:val="single" w:sz="8" w:space="0" w:color="000000"/>
               <w:bottom w:val="single" w:sz="8" w:space="0" w:color="000000"/>
             </w:tcBorders>
+            <w:vAlign w:val="center"/>
           </w:tcPr>
           <w:p>
             <w:pPr>
@@ -69,11 +69,11 @@
         <w:tc>
           <w:tcPr>
             <w:tcW w:type="dxa" w:w="1300"/>
-            <w:vAlign w:val="center"/>
             <w:tcBorders>
               <w:top w:val="single" w:sz="8" w:space="0" w:color="000000"/>
               <w:bottom w:val="single" w:sz="8" w:space="0" w:color="000000"/>
             </w:tcBorders>
+            <w:vAlign w:val="center"/>
           </w:tcPr>
           <w:p>
             <w:pPr>
@@ -92,11 +92,11 @@
         <w:tc>
           <w:tcPr>
             <w:tcW w:type="dxa" w:w="900"/>
-            <w:vAlign w:val="center"/>
             <w:tcBorders>
               <w:top w:val="single" w:sz="8" w:space="0" w:color="000000"/>
               <w:bottom w:val="single" w:sz="8" w:space="0" w:color="000000"/>
             </w:tcBorders>
+            <w:vAlign w:val="center"/>
           </w:tcPr>
           <w:p>
             <w:pPr>
@@ -115,11 +115,11 @@
         <w:tc>
           <w:tcPr>
             <w:tcW w:type="dxa" w:w="1300"/>
-            <w:vAlign w:val="center"/>
             <w:tcBorders>
               <w:top w:val="single" w:sz="8" w:space="0" w:color="000000"/>
               <w:bottom w:val="single" w:sz="8" w:space="0" w:color="000000"/>
             </w:tcBorders>
+            <w:vAlign w:val="center"/>
           </w:tcPr>
           <w:p>
             <w:pPr>
@@ -138,11 +138,11 @@
         <w:tc>
           <w:tcPr>
             <w:tcW w:type="dxa" w:w="900"/>
-            <w:vAlign w:val="center"/>
             <w:tcBorders>
               <w:top w:val="single" w:sz="8" w:space="0" w:color="000000"/>
               <w:bottom w:val="single" w:sz="8" w:space="0" w:color="000000"/>
             </w:tcBorders>
+            <w:vAlign w:val="center"/>
           </w:tcPr>
           <w:p>
             <w:pPr>
@@ -886,7 +886,6 @@
         <w:tc>
           <w:tcPr>
             <w:tcW w:type="dxa" w:w="4270"/>
-            <w:vAlign w:val="center"/>
             <w:tcBorders>
               <w:top w:val="single" w:sz="8" w:space="0" w:color="000000"/>
             </w:tcBorders>
@@ -894,6 +893,7 @@
               <w:top w:val="single" w:sz="8" w:space="0" w:color="000000"/>
               <w:bottom w:val="single" w:sz="8" w:space="0" w:color="000000"/>
             </w:tcBorders>
+            <w:vAlign w:val="center"/>
           </w:tcPr>
           <w:p>
             <w:pPr>
@@ -912,7 +912,6 @@
         <w:tc>
           <w:tcPr>
             <w:tcW w:type="dxa" w:w="1300"/>
-            <w:vAlign w:val="center"/>
             <w:tcBorders>
               <w:top w:val="single" w:sz="8" w:space="0" w:color="000000"/>
             </w:tcBorders>
@@ -920,6 +919,7 @@
               <w:top w:val="single" w:sz="8" w:space="0" w:color="000000"/>
               <w:bottom w:val="single" w:sz="8" w:space="0" w:color="000000"/>
             </w:tcBorders>
+            <w:vAlign w:val="center"/>
           </w:tcPr>
           <w:p>
             <w:pPr>
@@ -938,7 +938,6 @@
         <w:tc>
           <w:tcPr>
             <w:tcW w:type="dxa" w:w="900"/>
-            <w:vAlign w:val="center"/>
             <w:tcBorders>
               <w:top w:val="single" w:sz="8" w:space="0" w:color="000000"/>
             </w:tcBorders>
@@ -946,6 +945,7 @@
               <w:top w:val="single" w:sz="8" w:space="0" w:color="000000"/>
               <w:bottom w:val="single" w:sz="8" w:space="0" w:color="000000"/>
             </w:tcBorders>
+            <w:vAlign w:val="center"/>
           </w:tcPr>
           <w:p>
             <w:pPr>
@@ -964,7 +964,6 @@
         <w:tc>
           <w:tcPr>
             <w:tcW w:type="dxa" w:w="1300"/>
-            <w:vAlign w:val="center"/>
             <w:tcBorders>
               <w:top w:val="single" w:sz="8" w:space="0" w:color="000000"/>
             </w:tcBorders>
@@ -972,6 +971,7 @@
               <w:top w:val="single" w:sz="8" w:space="0" w:color="000000"/>
               <w:bottom w:val="single" w:sz="8" w:space="0" w:color="000000"/>
             </w:tcBorders>
+            <w:vAlign w:val="center"/>
           </w:tcPr>
           <w:p>
             <w:pPr>
@@ -990,7 +990,6 @@
         <w:tc>
           <w:tcPr>
             <w:tcW w:type="dxa" w:w="900"/>
-            <w:vAlign w:val="center"/>
             <w:tcBorders>
               <w:top w:val="single" w:sz="8" w:space="0" w:color="000000"/>
             </w:tcBorders>
@@ -998,6 +997,7 @@
               <w:top w:val="single" w:sz="8" w:space="0" w:color="000000"/>
               <w:bottom w:val="single" w:sz="8" w:space="0" w:color="000000"/>
             </w:tcBorders>
+            <w:vAlign w:val="center"/>
           </w:tcPr>
           <w:p>
             <w:pPr>
@@ -1071,8 +1071,8 @@
       <w:tblPr>
         <w:tblW w:type="auto" w:w="0"/>
         <w:tblLayout w:type="fixed"/>
+        <w:tblLayout w:type="fixed"/>
         <w:tblLook w:firstColumn="1" w:firstRow="1" w:lastColumn="0" w:lastRow="0" w:noHBand="0" w:noVBand="1" w:val="04A0"/>
-        <w:tblLayout w:type="fixed"/>
       </w:tblPr>
       <w:tblGrid>
         <w:gridCol w:w="4270"/>
@@ -1085,11 +1085,11 @@
         <w:tc>
           <w:tcPr>
             <w:tcW w:type="dxa" w:w="4270"/>
-            <w:vAlign w:val="center"/>
             <w:tcBorders>
               <w:top w:val="single" w:sz="8" w:space="0" w:color="000000"/>
               <w:bottom w:val="single" w:sz="8" w:space="0" w:color="000000"/>
             </w:tcBorders>
+            <w:vAlign w:val="center"/>
           </w:tcPr>
           <w:p>
             <w:pPr>
@@ -1108,11 +1108,11 @@
         <w:tc>
           <w:tcPr>
             <w:tcW w:type="dxa" w:w="1300"/>
-            <w:vAlign w:val="center"/>
             <w:tcBorders>
               <w:top w:val="single" w:sz="8" w:space="0" w:color="000000"/>
               <w:bottom w:val="single" w:sz="8" w:space="0" w:color="000000"/>
             </w:tcBorders>
+            <w:vAlign w:val="center"/>
           </w:tcPr>
           <w:p>
             <w:pPr>
@@ -1131,11 +1131,11 @@
         <w:tc>
           <w:tcPr>
             <w:tcW w:type="dxa" w:w="900"/>
-            <w:vAlign w:val="center"/>
             <w:tcBorders>
               <w:top w:val="single" w:sz="8" w:space="0" w:color="000000"/>
               <w:bottom w:val="single" w:sz="8" w:space="0" w:color="000000"/>
             </w:tcBorders>
+            <w:vAlign w:val="center"/>
           </w:tcPr>
           <w:p>
             <w:pPr>
@@ -1154,11 +1154,11 @@
         <w:tc>
           <w:tcPr>
             <w:tcW w:type="dxa" w:w="1300"/>
-            <w:vAlign w:val="center"/>
             <w:tcBorders>
               <w:top w:val="single" w:sz="8" w:space="0" w:color="000000"/>
               <w:bottom w:val="single" w:sz="8" w:space="0" w:color="000000"/>
             </w:tcBorders>
+            <w:vAlign w:val="center"/>
           </w:tcPr>
           <w:p>
             <w:pPr>
@@ -1177,11 +1177,11 @@
         <w:tc>
           <w:tcPr>
             <w:tcW w:type="dxa" w:w="900"/>
-            <w:vAlign w:val="center"/>
             <w:tcBorders>
               <w:top w:val="single" w:sz="8" w:space="0" w:color="000000"/>
               <w:bottom w:val="single" w:sz="8" w:space="0" w:color="000000"/>
             </w:tcBorders>
+            <w:vAlign w:val="center"/>
           </w:tcPr>
           <w:p>
             <w:pPr>
@@ -2035,7 +2035,6 @@
         <w:tc>
           <w:tcPr>
             <w:tcW w:type="dxa" w:w="4270"/>
-            <w:vAlign w:val="center"/>
             <w:tcBorders>
               <w:top w:val="single" w:sz="8" w:space="0" w:color="000000"/>
             </w:tcBorders>
@@ -2043,6 +2042,7 @@
               <w:top w:val="single" w:sz="8" w:space="0" w:color="000000"/>
               <w:bottom w:val="single" w:sz="8" w:space="0" w:color="000000"/>
             </w:tcBorders>
+            <w:vAlign w:val="center"/>
           </w:tcPr>
           <w:p>
             <w:pPr>
@@ -2061,7 +2061,6 @@
         <w:tc>
           <w:tcPr>
             <w:tcW w:type="dxa" w:w="1300"/>
-            <w:vAlign w:val="center"/>
             <w:tcBorders>
               <w:top w:val="single" w:sz="8" w:space="0" w:color="000000"/>
             </w:tcBorders>
@@ -2069,6 +2068,7 @@
               <w:top w:val="single" w:sz="8" w:space="0" w:color="000000"/>
               <w:bottom w:val="single" w:sz="8" w:space="0" w:color="000000"/>
             </w:tcBorders>
+            <w:vAlign w:val="center"/>
           </w:tcPr>
           <w:p>
             <w:pPr>
@@ -2087,7 +2087,6 @@
         <w:tc>
           <w:tcPr>
             <w:tcW w:type="dxa" w:w="900"/>
-            <w:vAlign w:val="center"/>
             <w:tcBorders>
               <w:top w:val="single" w:sz="8" w:space="0" w:color="000000"/>
             </w:tcBorders>
@@ -2095,6 +2094,7 @@
               <w:top w:val="single" w:sz="8" w:space="0" w:color="000000"/>
               <w:bottom w:val="single" w:sz="8" w:space="0" w:color="000000"/>
             </w:tcBorders>
+            <w:vAlign w:val="center"/>
           </w:tcPr>
           <w:p>
             <w:pPr>
@@ -2113,7 +2113,6 @@
         <w:tc>
           <w:tcPr>
             <w:tcW w:type="dxa" w:w="1300"/>
-            <w:vAlign w:val="center"/>
             <w:tcBorders>
               <w:top w:val="single" w:sz="8" w:space="0" w:color="000000"/>
             </w:tcBorders>
@@ -2121,6 +2120,7 @@
               <w:top w:val="single" w:sz="8" w:space="0" w:color="000000"/>
               <w:bottom w:val="single" w:sz="8" w:space="0" w:color="000000"/>
             </w:tcBorders>
+            <w:vAlign w:val="center"/>
           </w:tcPr>
           <w:p>
             <w:pPr>
@@ -2139,7 +2139,6 @@
         <w:tc>
           <w:tcPr>
             <w:tcW w:type="dxa" w:w="900"/>
-            <w:vAlign w:val="center"/>
             <w:tcBorders>
               <w:top w:val="single" w:sz="8" w:space="0" w:color="000000"/>
             </w:tcBorders>
@@ -2147,6 +2146,7 @@
               <w:top w:val="single" w:sz="8" w:space="0" w:color="000000"/>
               <w:bottom w:val="single" w:sz="8" w:space="0" w:color="000000"/>
             </w:tcBorders>
+            <w:vAlign w:val="center"/>
           </w:tcPr>
           <w:p>
             <w:pPr>

</xml_diff>